<commit_message>
📊 Daily Chinese DB update: 2026-06-14 | 173/2000 expressions
</commit_message>
<xml_diff>
--- a/data/03_Print_PDF/Study_Note_2026-06-14.docx
+++ b/data/03_Print_PDF/Study_Note_2026-06-14.docx
@@ -33,7 +33,7 @@
           <w:sz w:val="18"/>
           <w:rFonts w:eastAsia="Microsoft YaHei" w:ascii="맑은 고딕"/>
         </w:rPr>
-        <w:t>오늘의 핵심 네이티브 표현  4개  ·  한어 병음 · 한국어 의미 · 원문 · 실전 예문 수록</w:t>
+        <w:t>오늘의 핵심 네이티브 표현  2개  ·  한어 병음 · 한국어 의미 · 원문 · 실전 예문 수록</w:t>
       </w:r>
     </w:p>
     <w:p>
@@ -60,7 +60,7 @@
           <w:sz w:val="28"/>
           <w:rFonts w:eastAsia="Microsoft YaHei" w:ascii="Microsoft YaHei"/>
         </w:rPr>
-        <w:t>获悉</w:t>
+        <w:t>座谈会</w:t>
       </w:r>
       <w:r>
         <w:rPr>
@@ -71,7 +71,7 @@
           <w:sz w:val="18"/>
           <w:rFonts w:eastAsia="Microsoft YaHei" w:ascii="Calibri"/>
         </w:rPr>
-        <w:t xml:space="preserve">   [VERB]</w:t>
+        <w:t xml:space="preserve">   [NOUN]</w:t>
       </w:r>
     </w:p>
     <w:p>
@@ -97,7 +97,7 @@
           <w:sz w:val="20"/>
           <w:rFonts w:eastAsia="Microsoft YaHei" w:ascii="Calibri"/>
         </w:rPr>
-        <w:t>huòxī</w:t>
+        <w:t>zuò tán huì</w:t>
       </w:r>
     </w:p>
     <w:p>
@@ -123,7 +123,7 @@
           <w:sz w:val="21"/>
           <w:rFonts w:eastAsia="Microsoft YaHei" w:ascii="맑은 고딕"/>
         </w:rPr>
-        <w:t>알게 되다, 접수하다</w:t>
+        <w:t>좌담회, 간담회</w:t>
       </w:r>
     </w:p>
     <w:p>
@@ -150,7 +150,7 @@
           <w:sz w:val="19"/>
           <w:rFonts w:eastAsia="Microsoft YaHei" w:ascii="Microsoft YaHei"/>
         </w:rPr>
-        <w:t>"4月29日，记者从北京市发改委获悉，自2024"</w:t>
+        <w:t>"雄安新区高校建设发展座谈会在河北雄安新区召开。"</w:t>
       </w:r>
     </w:p>
     <w:p>
@@ -177,7 +177,7 @@
           <w:sz w:val="21"/>
           <w:rFonts w:eastAsia="Microsoft YaHei" w:ascii="Microsoft YaHei"/>
         </w:rPr>
-        <w:t>我们刚刚获悉，公司下个月将推出新产品。</w:t>
+        <w:t>公司每个季度都会组织一次员工座谈会，听取大家的意见。</w:t>
       </w:r>
     </w:p>
     <w:p>
@@ -220,7 +220,7 @@
           <w:sz w:val="28"/>
           <w:rFonts w:eastAsia="Microsoft YaHei" w:ascii="Microsoft YaHei"/>
         </w:rPr>
-        <w:t>稳稳的幸福</w:t>
+        <w:t>刷屏了</w:t>
       </w:r>
       <w:r>
         <w:rPr>
@@ -257,7 +257,7 @@
           <w:sz w:val="20"/>
           <w:rFonts w:eastAsia="Microsoft YaHei" w:ascii="Calibri"/>
         </w:rPr>
-        <w:t>wěnwěn de xìngfú</w:t>
+        <w:t>shuā píng le</w:t>
       </w:r>
     </w:p>
     <w:p>
@@ -283,7 +283,7 @@
           <w:sz w:val="21"/>
           <w:rFonts w:eastAsia="Microsoft YaHei" w:ascii="맑은 고딕"/>
         </w:rPr>
-        <w:t>안정적인 행복</w:t>
+        <w:t>(인터넷에서) 화면을 도배하다, 화제가 되다</w:t>
       </w:r>
     </w:p>
     <w:p>
@@ -310,7 +310,7 @@
           <w:sz w:val="19"/>
           <w:rFonts w:eastAsia="Microsoft YaHei" w:ascii="Microsoft YaHei"/>
         </w:rPr>
-        <w:t>"十年磨一剑！神仙学校给你稳稳的幸福."</w:t>
+        <w:t>"留学圈被一所“年轻”的美高刷屏了"</w:t>
       </w:r>
     </w:p>
     <w:p>
@@ -337,327 +337,7 @@
           <w:sz w:val="21"/>
           <w:rFonts w:eastAsia="Microsoft YaHei" w:ascii="Microsoft YaHei"/>
         </w:rPr>
-        <w:t>对很多人来说，一份稳定的工作和健康的家庭就是稳稳的幸福。</w:t>
-      </w:r>
-    </w:p>
-    <w:p>
-      <w:pPr>
-        <w:spacing w:before="120" w:after="0"/>
-      </w:pPr>
-      <w:r>
-        <w:rPr>
-          <w:rFonts w:ascii="맑은 고딕" w:hAnsi="맑은 고딕"/>
-          <w:b w:val="0"/>
-          <w:i w:val="0"/>
-          <w:color w:val="C8C8C8"/>
-          <w:sz w:val="14"/>
-          <w:rFonts w:eastAsia="Microsoft YaHei" w:ascii="맑은 고딕"/>
-        </w:rPr>
-        <w:t>────────────────────────────────────────────────────────────</w:t>
-      </w:r>
-    </w:p>
-    <w:p>
-      <w:pPr>
-        <w:spacing w:before="200" w:after="40"/>
-      </w:pPr>
-      <w:r>
-        <w:rPr>
-          <w:rFonts w:ascii="맑은 고딕" w:hAnsi="맑은 고딕"/>
-          <w:b w:val="0"/>
-          <w:i w:val="0"/>
-          <w:color w:val="969696"/>
-          <w:sz w:val="20"/>
-          <w:rFonts w:eastAsia="Microsoft YaHei" w:ascii="맑은 고딕"/>
-        </w:rPr>
-        <w:t xml:space="preserve">003.  </w:t>
-      </w:r>
-      <w:r>
-        <w:rPr>
-          <w:rFonts w:ascii="Microsoft YaHei" w:hAnsi="Microsoft YaHei"/>
-          <w:b/>
-          <w:i w:val="0"/>
-          <w:color w:val="143CB4"/>
-          <w:sz w:val="28"/>
-          <w:rFonts w:eastAsia="Microsoft YaHei" w:ascii="Microsoft YaHei"/>
-        </w:rPr>
-        <w:t>受到关注</w:t>
-      </w:r>
-      <w:r>
-        <w:rPr>
-          <w:rFonts w:ascii="Calibri" w:hAnsi="Calibri"/>
-          <w:b w:val="0"/>
-          <w:i w:val="0"/>
-          <w:color w:val="787878"/>
-          <w:sz w:val="18"/>
-          <w:rFonts w:eastAsia="Microsoft YaHei" w:ascii="Calibri"/>
-        </w:rPr>
-        <w:t xml:space="preserve">   [VERB PHRASE]</w:t>
-      </w:r>
-    </w:p>
-    <w:p>
-      <w:pPr>
-        <w:spacing w:before="0" w:after="40"/>
-      </w:pPr>
-      <w:r>
-        <w:rPr>
-          <w:rFonts w:ascii="맑은 고딕" w:hAnsi="맑은 고딕"/>
-          <w:b w:val="0"/>
-          <w:i w:val="0"/>
-          <w:sz w:val="20"/>
-          <w:rFonts w:eastAsia="Microsoft YaHei" w:ascii="맑은 고딕"/>
-        </w:rPr>
-        <w:t xml:space="preserve">🔊 </w:t>
-      </w:r>
-      <w:r>
-        <w:rPr>
-          <w:rFonts w:ascii="Calibri" w:hAnsi="Calibri"/>
-          <w:b w:val="0"/>
-          <w:i/>
-          <w:color w:val="505050"/>
-          <w:sz w:val="20"/>
-          <w:rFonts w:eastAsia="Microsoft YaHei" w:ascii="Calibri"/>
-        </w:rPr>
-        <w:t>shòudào guānzhù</w:t>
-      </w:r>
-    </w:p>
-    <w:p>
-      <w:pPr>
-        <w:spacing w:before="0" w:after="60"/>
-      </w:pPr>
-      <w:r>
-        <w:rPr>
-          <w:rFonts w:ascii="맑은 고딕" w:hAnsi="맑은 고딕"/>
-          <w:b/>
-          <w:i w:val="0"/>
-          <w:color w:val="282828"/>
-          <w:sz w:val="20"/>
-          <w:rFonts w:eastAsia="Microsoft YaHei" w:ascii="맑은 고딕"/>
-        </w:rPr>
-        <w:t xml:space="preserve">💡 의미  </w:t>
-      </w:r>
-      <w:r>
-        <w:rPr>
-          <w:rFonts w:ascii="맑은 고딕" w:hAnsi="맑은 고딕"/>
-          <w:b w:val="0"/>
-          <w:i w:val="0"/>
-          <w:sz w:val="21"/>
-          <w:rFonts w:eastAsia="Microsoft YaHei" w:ascii="맑은 고딕"/>
-        </w:rPr>
-        <w:t>주목받다, 관심을 받다</w:t>
-      </w:r>
-    </w:p>
-    <w:p>
-      <w:pPr>
-        <w:spacing w:before="0" w:after="40"/>
-      </w:pPr>
-      <w:r>
-        <w:rPr>
-          <w:rFonts w:ascii="맑은 고딕" w:hAnsi="맑은 고딕"/>
-          <w:b/>
-          <w:i w:val="0"/>
-          <w:color w:val="646464"/>
-          <w:sz w:val="19"/>
-          <w:rFonts w:eastAsia="Microsoft YaHei" w:ascii="맑은 고딕"/>
-        </w:rPr>
-        <w:t xml:space="preserve">📌 원문  </w:t>
-      </w:r>
-      <w:r>
-        <w:rPr>
-          <w:rFonts w:ascii="Microsoft YaHei" w:hAnsi="Microsoft YaHei"/>
-          <w:b w:val="0"/>
-          <w:i/>
-          <w:color w:val="5A5A5A"/>
-          <w:sz w:val="19"/>
-          <w:rFonts w:eastAsia="Microsoft YaHei" w:ascii="Microsoft YaHei"/>
-        </w:rPr>
-        <w:t>"这次受到关注的是在成都高新区双塔双集举办的“胡安·米罗：艺述真言”艺术展。"</w:t>
-      </w:r>
-    </w:p>
-    <w:p>
-      <w:pPr>
-        <w:spacing w:before="40" w:after="40"/>
-      </w:pPr>
-      <w:r>
-        <w:rPr>
-          <w:rFonts w:ascii="맑은 고딕" w:hAnsi="맑은 고딕"/>
-          <w:b/>
-          <w:i w:val="0"/>
-          <w:color w:val="007850"/>
-          <w:sz w:val="20"/>
-          <w:rFonts w:eastAsia="Microsoft YaHei" w:ascii="맑은 고딕"/>
-        </w:rPr>
-        <w:t xml:space="preserve">✏️ 예문  </w:t>
-      </w:r>
-      <w:r>
-        <w:rPr>
-          <w:rFonts w:ascii="Microsoft YaHei" w:hAnsi="Microsoft YaHei"/>
-          <w:b/>
-          <w:i w:val="0"/>
-          <w:color w:val="00643C"/>
-          <w:sz w:val="21"/>
-          <w:rFonts w:eastAsia="Microsoft YaHei" w:ascii="Microsoft YaHei"/>
-        </w:rPr>
-        <w:t>他的新书一上市就受到了广泛关注，销量非常好。</w:t>
-      </w:r>
-    </w:p>
-    <w:p>
-      <w:pPr>
-        <w:spacing w:before="120" w:after="0"/>
-      </w:pPr>
-      <w:r>
-        <w:rPr>
-          <w:rFonts w:ascii="맑은 고딕" w:hAnsi="맑은 고딕"/>
-          <w:b w:val="0"/>
-          <w:i w:val="0"/>
-          <w:color w:val="C8C8C8"/>
-          <w:sz w:val="14"/>
-          <w:rFonts w:eastAsia="Microsoft YaHei" w:ascii="맑은 고딕"/>
-        </w:rPr>
-        <w:t>────────────────────────────────────────────────────────────</w:t>
-      </w:r>
-    </w:p>
-    <w:p>
-      <w:pPr>
-        <w:spacing w:before="200" w:after="40"/>
-      </w:pPr>
-      <w:r>
-        <w:rPr>
-          <w:rFonts w:ascii="맑은 고딕" w:hAnsi="맑은 고딕"/>
-          <w:b w:val="0"/>
-          <w:i w:val="0"/>
-          <w:color w:val="969696"/>
-          <w:sz w:val="20"/>
-          <w:rFonts w:eastAsia="Microsoft YaHei" w:ascii="맑은 고딕"/>
-        </w:rPr>
-        <w:t xml:space="preserve">004.  </w:t>
-      </w:r>
-      <w:r>
-        <w:rPr>
-          <w:rFonts w:ascii="Microsoft YaHei" w:hAnsi="Microsoft YaHei"/>
-          <w:b/>
-          <w:i w:val="0"/>
-          <w:color w:val="143CB4"/>
-          <w:sz w:val="28"/>
-          <w:rFonts w:eastAsia="Microsoft YaHei" w:ascii="Microsoft YaHei"/>
-        </w:rPr>
-        <w:t>印象</w:t>
-      </w:r>
-      <w:r>
-        <w:rPr>
-          <w:rFonts w:ascii="Calibri" w:hAnsi="Calibri"/>
-          <w:b w:val="0"/>
-          <w:i w:val="0"/>
-          <w:color w:val="787878"/>
-          <w:sz w:val="18"/>
-          <w:rFonts w:eastAsia="Microsoft YaHei" w:ascii="Calibri"/>
-        </w:rPr>
-        <w:t xml:space="preserve">   [NOUN]</w:t>
-      </w:r>
-    </w:p>
-    <w:p>
-      <w:pPr>
-        <w:spacing w:before="0" w:after="40"/>
-      </w:pPr>
-      <w:r>
-        <w:rPr>
-          <w:rFonts w:ascii="맑은 고딕" w:hAnsi="맑은 고딕"/>
-          <w:b w:val="0"/>
-          <w:i w:val="0"/>
-          <w:sz w:val="20"/>
-          <w:rFonts w:eastAsia="Microsoft YaHei" w:ascii="맑은 고딕"/>
-        </w:rPr>
-        <w:t xml:space="preserve">🔊 </w:t>
-      </w:r>
-      <w:r>
-        <w:rPr>
-          <w:rFonts w:ascii="Calibri" w:hAnsi="Calibri"/>
-          <w:b w:val="0"/>
-          <w:i/>
-          <w:color w:val="505050"/>
-          <w:sz w:val="20"/>
-          <w:rFonts w:eastAsia="Microsoft YaHei" w:ascii="Calibri"/>
-        </w:rPr>
-        <w:t>yìnxiàng</w:t>
-      </w:r>
-    </w:p>
-    <w:p>
-      <w:pPr>
-        <w:spacing w:before="0" w:after="60"/>
-      </w:pPr>
-      <w:r>
-        <w:rPr>
-          <w:rFonts w:ascii="맑은 고딕" w:hAnsi="맑은 고딕"/>
-          <w:b/>
-          <w:i w:val="0"/>
-          <w:color w:val="282828"/>
-          <w:sz w:val="20"/>
-          <w:rFonts w:eastAsia="Microsoft YaHei" w:ascii="맑은 고딕"/>
-        </w:rPr>
-        <w:t xml:space="preserve">💡 의미  </w:t>
-      </w:r>
-      <w:r>
-        <w:rPr>
-          <w:rFonts w:ascii="맑은 고딕" w:hAnsi="맑은 고딕"/>
-          <w:b w:val="0"/>
-          <w:i w:val="0"/>
-          <w:sz w:val="21"/>
-          <w:rFonts w:eastAsia="Microsoft YaHei" w:ascii="맑은 고딕"/>
-        </w:rPr>
-        <w:t>인상</w:t>
-      </w:r>
-    </w:p>
-    <w:p>
-      <w:pPr>
-        <w:spacing w:before="0" w:after="40"/>
-      </w:pPr>
-      <w:r>
-        <w:rPr>
-          <w:rFonts w:ascii="맑은 고딕" w:hAnsi="맑은 고딕"/>
-          <w:b/>
-          <w:i w:val="0"/>
-          <w:color w:val="646464"/>
-          <w:sz w:val="19"/>
-          <w:rFonts w:eastAsia="Microsoft YaHei" w:ascii="맑은 고딕"/>
-        </w:rPr>
-        <w:t xml:space="preserve">📌 원문  </w:t>
-      </w:r>
-      <w:r>
-        <w:rPr>
-          <w:rFonts w:ascii="Microsoft YaHei" w:hAnsi="Microsoft YaHei"/>
-          <w:b w:val="0"/>
-          <w:i/>
-          <w:color w:val="5A5A5A"/>
-          <w:sz w:val="19"/>
-          <w:rFonts w:eastAsia="Microsoft YaHei" w:ascii="Microsoft YaHei"/>
-        </w:rPr>
-        <w:t>"却始终没有印象。"</w:t>
-      </w:r>
-    </w:p>
-    <w:p>
-      <w:pPr>
-        <w:spacing w:before="40" w:after="40"/>
-      </w:pPr>
-      <w:r>
-        <w:rPr>
-          <w:rFonts w:ascii="맑은 고딕" w:hAnsi="맑은 고딕"/>
-          <w:b/>
-          <w:i w:val="0"/>
-          <w:color w:val="007850"/>
-          <w:sz w:val="20"/>
-          <w:rFonts w:eastAsia="Microsoft YaHei" w:ascii="맑은 고딕"/>
-        </w:rPr>
-        <w:t xml:space="preserve">✏️ 예문  </w:t>
-      </w:r>
-      <w:r>
-        <w:rPr>
-          <w:rFonts w:ascii="Microsoft YaHei" w:hAnsi="Microsoft YaHei"/>
-          <w:b/>
-          <w:i w:val="0"/>
-          <w:color w:val="00643C"/>
-          <w:sz w:val="21"/>
-          <w:rFonts w:eastAsia="Microsoft YaHei" w:ascii="Microsoft YaHei"/>
-        </w:rPr>
-        <w:t>他给我的第一印象非常好，看起来很专业。</w:t>
+        <w:t>昨晚那部电影的预告片在朋友圈刷屏了，大家都想去看。</w:t>
       </w:r>
     </w:p>
     <w:sectPr>

</xml_diff>